<commit_message>
Aggiornamento del 08/10/2026 18:12
</commit_message>
<xml_diff>
--- a/manuali/guida-rapida.docx
+++ b/manuali/guida-rapida.docx
@@ -28,7 +28,7 @@
           <w:sz w:val="18"/>
           <w:szCs w:val="18"/>
         </w:rPr>
-        <w:t xml:space="preserve">Versione 3.44.0 · tutto l’essenziale in una pagina · by Lollo ®2026</w:t>
+        <w:t xml:space="preserve">Versione 3.45.0 · tutto l’essenziale in una pagina · by Lollo ®2026</w:t>
       </w:r>
     </w:p>
     <w:p>
@@ -1262,72 +1262,6 @@
           </w:p>
         </w:tc>
       </w:tr>
-      <w:tr>
-        <w:trPr>
-          <w:cantSplit/>
-        </w:trPr>
-        <w:tc>
-          <w:tcPr>
-            <w:tcW w:type="dxa" w:w="4300"/>
-            <w:tcBorders>
-              <w:top w:val="single" w:color="CFD6C9" w:sz="4"/>
-              <w:left w:val="single" w:color="CFD6C9" w:sz="4"/>
-              <w:bottom w:val="single" w:color="CFD6C9" w:sz="4"/>
-              <w:right w:val="single" w:color="CFD6C9" w:sz="4"/>
-            </w:tcBorders>
-            <w:tcMar>
-              <w:top w:type="dxa" w:w="20"/>
-              <w:left w:type="dxa" w:w="80"/>
-              <w:bottom w:type="dxa" w:w="20"/>
-              <w:right w:type="dxa" w:w="80"/>
-            </w:tcMar>
-          </w:tcPr>
-          <w:p>
-            <w:r>
-              <w:rPr>
-                <w:sz w:val="16"/>
-                <w:szCs w:val="16"/>
-              </w:rPr>
-              <w:t xml:space="preserve">cercare una funzione</w:t>
-            </w:r>
-          </w:p>
-        </w:tc>
-        <w:tc>
-          <w:tcPr>
-            <w:tcW w:type="dxa" w:w="6166"/>
-            <w:tcBorders>
-              <w:top w:val="single" w:color="CFD6C9" w:sz="4"/>
-              <w:left w:val="single" w:color="CFD6C9" w:sz="4"/>
-              <w:bottom w:val="single" w:color="CFD6C9" w:sz="4"/>
-              <w:right w:val="single" w:color="CFD6C9" w:sz="4"/>
-            </w:tcBorders>
-            <w:tcMar>
-              <w:top w:type="dxa" w:w="20"/>
-              <w:left w:type="dxa" w:w="80"/>
-              <w:bottom w:type="dxa" w:w="20"/>
-              <w:right w:type="dxa" w:w="80"/>
-            </w:tcMar>
-          </w:tcPr>
-          <w:p>
-            <w:r>
-              <w:rPr>
-                <w:b/>
-                <w:bCs/>
-                <w:sz w:val="16"/>
-                <w:szCs w:val="16"/>
-              </w:rPr>
-              <w:t xml:space="preserve">? Aiuto</w:t>
-            </w:r>
-            <w:r>
-              <w:rPr>
-                <w:sz w:val="16"/>
-                <w:szCs w:val="16"/>
-              </w:rPr>
-              <w:t xml:space="preserve"> in alto → casella di ricerca</w:t>
-            </w:r>
-          </w:p>
-        </w:tc>
-      </w:tr>
     </w:tbl>
     <w:p>
       <w:pPr>
@@ -1475,7 +1409,39 @@
           <w:sz w:val="17"/>
           <w:szCs w:val="17"/>
         </w:rPr>
-        <w:t xml:space="preserve"> sparisce il margine.</w:t>
+        <w:t xml:space="preserve"> sparisce il margine. Il lucchetto </w:t>
+      </w:r>
+      <w:r>
+        <w:rPr>
+          <w:b/>
+          <w:bCs/>
+          <w:sz w:val="17"/>
+          <w:szCs w:val="17"/>
+        </w:rPr>
+        <w:t xml:space="preserve">🔓</w:t>
+      </w:r>
+      <w:r>
+        <w:rPr>
+          <w:sz w:val="17"/>
+          <w:szCs w:val="17"/>
+        </w:rPr>
+        <w:t xml:space="preserve"> in alto </w:t>
+      </w:r>
+      <w:r>
+        <w:rPr>
+          <w:b/>
+          <w:bCs/>
+          <w:sz w:val="17"/>
+          <w:szCs w:val="17"/>
+        </w:rPr>
+        <w:t xml:space="preserve">blocca</w:t>
+      </w:r>
+      <w:r>
+        <w:rPr>
+          <w:sz w:val="17"/>
+          <w:szCs w:val="17"/>
+        </w:rPr>
+        <w:t xml:space="preserve"> la scheda: si consulta e si stampa, ma non si modifica né si elimina finché non tocchi «🔓 Sblocca».</w:t>
       </w:r>
     </w:p>
     <w:p>

</xml_diff>

<commit_message>
Aggiornamento del 09/10/2026 08:05
</commit_message>
<xml_diff>
--- a/manuali/guida-rapida.docx
+++ b/manuali/guida-rapida.docx
@@ -28,7 +28,7 @@
           <w:sz w:val="18"/>
           <w:szCs w:val="18"/>
         </w:rPr>
-        <w:t xml:space="preserve">Versione 3.45.0 · tutto l’essenziale in una pagina · by Lollo ®2026</w:t>
+        <w:t xml:space="preserve">Versione 3.46.0 · tutto l’essenziale in una pagina · by Lollo ®2026</w:t>
       </w:r>
     </w:p>
     <w:p>
@@ -1076,145 +1076,6 @@
                 <w:sz w:val="16"/>
                 <w:szCs w:val="16"/>
               </w:rPr>
-              <w:t xml:space="preserve">usare l’assistente AI</w:t>
-            </w:r>
-          </w:p>
-        </w:tc>
-        <w:tc>
-          <w:tcPr>
-            <w:tcW w:type="dxa" w:w="6166"/>
-            <w:tcBorders>
-              <w:top w:val="single" w:color="CFD6C9" w:sz="4"/>
-              <w:left w:val="single" w:color="CFD6C9" w:sz="4"/>
-              <w:bottom w:val="single" w:color="CFD6C9" w:sz="4"/>
-              <w:right w:val="single" w:color="CFD6C9" w:sz="4"/>
-            </w:tcBorders>
-            <w:tcMar>
-              <w:top w:type="dxa" w:w="20"/>
-              <w:left w:type="dxa" w:w="80"/>
-              <w:bottom w:type="dxa" w:w="20"/>
-              <w:right w:type="dxa" w:w="80"/>
-            </w:tcMar>
-          </w:tcPr>
-          <w:p>
-            <w:r>
-              <w:rPr>
-                <w:sz w:val="16"/>
-                <w:szCs w:val="16"/>
-              </w:rPr>
-              <w:t xml:space="preserve">Configurazione → </w:t>
-            </w:r>
-            <w:r>
-              <w:rPr>
-                <w:b/>
-                <w:bCs/>
-                <w:sz w:val="16"/>
-                <w:szCs w:val="16"/>
-              </w:rPr>
-              <w:t xml:space="preserve">Assistente AI</w:t>
-            </w:r>
-            <w:r>
-              <w:rPr>
-                <w:sz w:val="16"/>
-                <w:szCs w:val="16"/>
-              </w:rPr>
-              <w:t xml:space="preserve"> → Carica open.env</w:t>
-            </w:r>
-          </w:p>
-        </w:tc>
-      </w:tr>
-      <w:tr>
-        <w:trPr>
-          <w:cantSplit/>
-        </w:trPr>
-        <w:tc>
-          <w:tcPr>
-            <w:tcW w:type="dxa" w:w="4300"/>
-            <w:tcBorders>
-              <w:top w:val="single" w:color="CFD6C9" w:sz="4"/>
-              <w:left w:val="single" w:color="CFD6C9" w:sz="4"/>
-              <w:bottom w:val="single" w:color="CFD6C9" w:sz="4"/>
-              <w:right w:val="single" w:color="CFD6C9" w:sz="4"/>
-            </w:tcBorders>
-            <w:tcMar>
-              <w:top w:type="dxa" w:w="20"/>
-              <w:left w:type="dxa" w:w="80"/>
-              <w:bottom w:type="dxa" w:w="20"/>
-              <w:right w:type="dxa" w:w="80"/>
-            </w:tcMar>
-          </w:tcPr>
-          <w:p>
-            <w:r>
-              <w:rPr>
-                <w:sz w:val="16"/>
-                <w:szCs w:val="16"/>
-              </w:rPr>
-              <w:t xml:space="preserve">ingrandire i caratteri, una o due colonne</w:t>
-            </w:r>
-          </w:p>
-        </w:tc>
-        <w:tc>
-          <w:tcPr>
-            <w:tcW w:type="dxa" w:w="6166"/>
-            <w:tcBorders>
-              <w:top w:val="single" w:color="CFD6C9" w:sz="4"/>
-              <w:left w:val="single" w:color="CFD6C9" w:sz="4"/>
-              <w:bottom w:val="single" w:color="CFD6C9" w:sz="4"/>
-              <w:right w:val="single" w:color="CFD6C9" w:sz="4"/>
-            </w:tcBorders>
-            <w:tcMar>
-              <w:top w:type="dxa" w:w="20"/>
-              <w:left w:type="dxa" w:w="80"/>
-              <w:bottom w:type="dxa" w:w="20"/>
-              <w:right w:type="dxa" w:w="80"/>
-            </w:tcMar>
-          </w:tcPr>
-          <w:p>
-            <w:r>
-              <w:rPr>
-                <w:sz w:val="16"/>
-                <w:szCs w:val="16"/>
-              </w:rPr>
-              <w:t xml:space="preserve">Configurazione → </w:t>
-            </w:r>
-            <w:r>
-              <w:rPr>
-                <w:b/>
-                <w:bCs/>
-                <w:sz w:val="16"/>
-                <w:szCs w:val="16"/>
-              </w:rPr>
-              <w:t xml:space="preserve">Schermo e modifica delle schede</w:t>
-            </w:r>
-          </w:p>
-        </w:tc>
-      </w:tr>
-      <w:tr>
-        <w:trPr>
-          <w:cantSplit/>
-        </w:trPr>
-        <w:tc>
-          <w:tcPr>
-            <w:tcW w:type="dxa" w:w="4300"/>
-            <w:tcBorders>
-              <w:top w:val="single" w:color="CFD6C9" w:sz="4"/>
-              <w:left w:val="single" w:color="CFD6C9" w:sz="4"/>
-              <w:bottom w:val="single" w:color="CFD6C9" w:sz="4"/>
-              <w:right w:val="single" w:color="CFD6C9" w:sz="4"/>
-            </w:tcBorders>
-            <w:tcMar>
-              <w:top w:type="dxa" w:w="20"/>
-              <w:left w:type="dxa" w:w="80"/>
-              <w:bottom w:type="dxa" w:w="20"/>
-              <w:right w:type="dxa" w:w="80"/>
-            </w:tcMar>
-          </w:tcPr>
-          <w:p>
-            <w:r>
-              <w:rPr>
-                <w:sz w:val="16"/>
-                <w:szCs w:val="16"/>
-              </w:rPr>
               <w:t xml:space="preserve">aggiornare l’app</w:t>
             </w:r>
           </w:p>
@@ -1442,6 +1303,82 @@
           <w:szCs w:val="17"/>
         </w:rPr>
         <w:t xml:space="preserve"> la scheda: si consulta e si stampa, ma non si modifica né si elimina finché non tocchi «🔓 Sblocca».</w:t>
+      </w:r>
+    </w:p>
+    <w:p>
+      <w:pPr>
+        <w:spacing w:after="40" w:line="240"/>
+      </w:pPr>
+      <w:r>
+        <w:rPr>
+          <w:sz w:val="17"/>
+          <w:szCs w:val="17"/>
+        </w:rPr>
+        <w:t xml:space="preserve">Con la rete: </w:t>
+      </w:r>
+      <w:r>
+        <w:rPr>
+          <w:b/>
+          <w:bCs/>
+          <w:sz w:val="17"/>
+          <w:szCs w:val="17"/>
+        </w:rPr>
+        <w:t xml:space="preserve">🌍 Stato IUCN e nomi comuni</w:t>
+      </w:r>
+      <w:r>
+        <w:rPr>
+          <w:sz w:val="17"/>
+          <w:szCs w:val="17"/>
+        </w:rPr>
+        <w:t xml:space="preserve"> sotto il nome (GBIF), </w:t>
+      </w:r>
+      <w:r>
+        <w:rPr>
+          <w:b/>
+          <w:bCs/>
+          <w:sz w:val="17"/>
+          <w:szCs w:val="17"/>
+        </w:rPr>
+        <w:t xml:space="preserve">📍 Dalle coordinate GPS</w:t>
+      </w:r>
+      <w:r>
+        <w:rPr>
+          <w:sz w:val="17"/>
+          <w:szCs w:val="17"/>
+        </w:rPr>
+        <w:t xml:space="preserve"> per la Località (OpenStreetMap), </w:t>
+      </w:r>
+      <w:r>
+        <w:rPr>
+          <w:b/>
+          <w:bCs/>
+          <w:sz w:val="17"/>
+          <w:szCs w:val="17"/>
+        </w:rPr>
+        <w:t xml:space="preserve">⛰ Quota del terreno</w:t>
+      </w:r>
+      <w:r>
+        <w:rPr>
+          <w:sz w:val="17"/>
+          <w:szCs w:val="17"/>
+        </w:rPr>
+        <w:t xml:space="preserve"> nella Posizione GPS (Open-Meteo). </w:t>
+      </w:r>
+      <w:r>
+        <w:rPr>
+          <w:b/>
+          <w:bCs/>
+          <w:sz w:val="17"/>
+          <w:szCs w:val="17"/>
+        </w:rPr>
+        <w:t xml:space="preserve">🌤 Meteo e pollini</w:t>
+      </w:r>
+      <w:r>
+        <w:rPr>
+          <w:sz w:val="17"/>
+          <w:szCs w:val="17"/>
+        </w:rPr>
+        <w:t xml:space="preserve"> è in + Opzioni.</w:t>
       </w:r>
     </w:p>
     <w:p>

</xml_diff>

<commit_message>
Aggiornamento del 09/10/2026 21:19
</commit_message>
<xml_diff>
--- a/manuali/guida-rapida.docx
+++ b/manuali/guida-rapida.docx
@@ -28,7 +28,7 @@
           <w:sz w:val="18"/>
           <w:szCs w:val="18"/>
         </w:rPr>
-        <w:t xml:space="preserve">Versione 3.46.0 · tutto l’essenziale in una pagina · by Lollo ®2026</w:t>
+        <w:t xml:space="preserve">Versione 3.47.0 · tutto l’essenziale in una pagina · by Lollo ®2026</w:t>
       </w:r>
     </w:p>
     <w:p>
@@ -1497,30 +1497,46 @@
           <w:sz w:val="17"/>
           <w:szCs w:val="17"/>
         </w:rPr>
-        <w:t xml:space="preserve">PlantNet</w:t>
-      </w:r>
-      <w:r>
-        <w:rPr>
-          <w:sz w:val="17"/>
-          <w:szCs w:val="17"/>
-        </w:rPr>
-        <w:t xml:space="preserve"> (chiave gratuita): «🔎 Identifica» su una foto. </w:t>
-      </w:r>
-      <w:r>
-        <w:rPr>
-          <w:b/>
-          <w:bCs/>
-          <w:sz w:val="17"/>
-          <w:szCs w:val="17"/>
-        </w:rPr>
-        <w:t xml:space="preserve">AI</w:t>
-      </w:r>
-      <w:r>
-        <w:rPr>
-          <w:sz w:val="17"/>
-          <w:szCs w:val="17"/>
-        </w:rPr>
-        <w:t xml:space="preserve"> (facoltativa, file </w:t>
+        <w:t xml:space="preserve">🔎 Super ricerca</w:t>
+      </w:r>
+      <w:r>
+        <w:rPr>
+          <w:sz w:val="17"/>
+          <w:szCs w:val="17"/>
+        </w:rPr>
+        <w:t xml:space="preserve"> sotto il nome: guida, Wikipedia, GBIF, </w:t>
+      </w:r>
+      <w:r>
+        <w:rPr>
+          <w:b/>
+          <w:bCs/>
+          <w:sz w:val="17"/>
+          <w:szCs w:val="17"/>
+        </w:rPr>
+        <w:t xml:space="preserve">PlantNet con tutte le foto</w:t>
+      </w:r>
+      <w:r>
+        <w:rPr>
+          <w:sz w:val="17"/>
+          <w:szCs w:val="17"/>
+        </w:rPr>
+        <w:t xml:space="preserve"> e </w:t>
+      </w:r>
+      <w:r>
+        <w:rPr>
+          <w:b/>
+          <w:bCs/>
+          <w:sz w:val="17"/>
+          <w:szCs w:val="17"/>
+        </w:rPr>
+        <w:t xml:space="preserve">ogni AI</w:t>
+      </w:r>
+      <w:r>
+        <w:rPr>
+          <w:sz w:val="17"/>
+          <w:szCs w:val="17"/>
+        </w:rPr>
+        <w:t xml:space="preserve"> di </w:t>
       </w:r>
       <w:r>
         <w:rPr>
@@ -1535,7 +1551,23 @@
           <w:sz w:val="17"/>
           <w:szCs w:val="17"/>
         </w:rPr>
-        <w:t xml:space="preserve">): invia solo nome e caratteri.</w:t>
+        <w:t xml:space="preserve"> (foto, nome, caratteri; mai GPS o note), più presenza vicino, foto di confronto e </w:t>
+      </w:r>
+      <w:r>
+        <w:rPr>
+          <w:b/>
+          <w:bCs/>
+          <w:sz w:val="17"/>
+          <w:szCs w:val="17"/>
+        </w:rPr>
+        <w:t xml:space="preserve">Google Lens</w:t>
+      </w:r>
+      <w:r>
+        <w:rPr>
+          <w:sz w:val="17"/>
+          <w:szCs w:val="17"/>
+        </w:rPr>
+        <w:t xml:space="preserve">.</w:t>
       </w:r>
     </w:p>
     <w:p>
@@ -2216,7 +2248,7 @@
     </w:p>
     <w:sectPr>
       <w:pgSz w:w="11906" w:h="16838" w:orient="portrait"/>
-      <w:pgMar w:top="640" w:right="720" w:bottom="600" w:left="720" w:header="708" w:footer="708" w:gutter="0"/>
+      <w:pgMar w:top="560" w:right="720" w:bottom="500" w:left="720" w:header="708" w:footer="708" w:gutter="0"/>
       <w:pgNumType/>
       <w:docGrid w:linePitch="360"/>
     </w:sectPr>

</xml_diff>

<commit_message>
Aggiornamento del 14/10/2026 21:44
</commit_message>
<xml_diff>
--- a/manuali/guida-rapida.docx
+++ b/manuali/guida-rapida.docx
@@ -28,7 +28,7 @@
           <w:sz w:val="18"/>
           <w:szCs w:val="18"/>
         </w:rPr>
-        <w:t xml:space="preserve">Versione 3.47.0 · tutto l’essenziale in una pagina · by Lollo ®2026</w:t>
+        <w:t xml:space="preserve">Versione 3.48.0 · tutto l’essenziale in una pagina · by Lollo ®2026</w:t>
       </w:r>
     </w:p>
     <w:p>
@@ -570,6 +570,13 @@
                 <w:szCs w:val="16"/>
               </w:rPr>
               <w:t xml:space="preserve">Stampa</w:t>
+            </w:r>
+            <w:r>
+              <w:rPr>
+                <w:sz w:val="16"/>
+                <w:szCs w:val="16"/>
+              </w:rPr>
+              <w:t xml:space="preserve"> (coordinate in gradi, UTM o nessuna)</w:t>
             </w:r>
           </w:p>
         </w:tc>

</xml_diff>